<commit_message>
Remove obsolete Science for Everyone branding
</commit_message>
<xml_diff>
--- a/Science Books/Physics/Volume 1/drafts/Physics Vol 1  Motion Forces Time and Relativity with pics.docx
+++ b/Science Books/Physics/Volume 1/drafts/Physics Vol 1  Motion Forces Time and Relativity with pics.docx
@@ -8,7 +8,7 @@
         <w:jc w:val="center"/>
       </w:pPr>
       <w:r>
-        <w:t xml:space="preserve">Science for Everyone: Physics</w:t>
+        <w:t xml:space="preserve">Physics, Actually: Physics</w:t>
       </w:r>
     </w:p>
     <w:p>
@@ -26,7 +26,7 @@
         <w:jc w:val="center"/>
       </w:pPr>
       <w:r>
-        <w:t xml:space="preserve">A Science for Everyone Volume</w:t>
+        <w:t xml:space="preserve">A Physics, Actually Volume</w:t>
       </w:r>
     </w:p>
     <w:p/>
@@ -51,7 +51,7 @@
         <w:spacing w:after="120"/>
       </w:pPr>
       <w:r>
-        <w:t xml:space="preserve">Science for Everyone: Physics</w:t>
+        <w:t xml:space="preserve">Physics, Actually: Physics</w:t>
       </w:r>
     </w:p>
     <w:p>
@@ -137,7 +137,7 @@
         <w:rPr>
           <w:sz w:val="18"/>
         </w:rPr>
-        <w:t xml:space="preserve">Science for Everyone series</w:t>
+        <w:t xml:space="preserve">Physics, Actually series</w:t>
       </w:r>
     </w:p>
     <w:p>
@@ -523,7 +523,7 @@
         <w:jc w:val="center"/>
       </w:pPr>
       <w:r>
-        <w:t>Science for Everyone</w:t>
+        <w:t>Physics, Actually</w:t>
       </w:r>
     </w:p>
     <w:p>
@@ -960,7 +960,7 @@
         <w:jc w:val="center"/>
       </w:pPr>
       <w:r>
-        <w:t>Science for Everyone</w:t>
+        <w:t>Physics, Actually</w:t>
       </w:r>
     </w:p>
     <w:p>
@@ -3282,7 +3282,7 @@
         <w:rPr>
           <w:i/>
         </w:rPr>
-        <w:t xml:space="preserve">Science for Everyone</w:t>
+        <w:t xml:space="preserve">Physics, Actually</w:t>
       </w:r>
       <w:r>
         <w:t xml:space="preserve">.</w:t>
@@ -3318,7 +3318,7 @@
         <w:jc w:val="center"/>
       </w:pPr>
       <w:r>
-        <w:t>Science for Everyone</w:t>
+        <w:t>Physics, Actually</w:t>
       </w:r>
     </w:p>
     <w:p>
@@ -3953,7 +3953,7 @@
         <w:jc w:val="center"/>
       </w:pPr>
       <w:r>
-        <w:t>Science for Everyone</w:t>
+        <w:t>Physics, Actually</w:t>
       </w:r>
     </w:p>
     <w:p>
@@ -4306,7 +4306,7 @@
         <w:jc w:val="center"/>
       </w:pPr>
       <w:r>
-        <w:t>Science for Everyone</w:t>
+        <w:t>Physics, Actually</w:t>
       </w:r>
     </w:p>
     <w:p>
@@ -4584,7 +4584,7 @@
         <w:jc w:val="center"/>
       </w:pPr>
       <w:r>
-        <w:t>Science for Everyone</w:t>
+        <w:t>Physics, Actually</w:t>
       </w:r>
     </w:p>
     <w:p>
@@ -4905,7 +4905,7 @@
         <w:jc w:val="center"/>
       </w:pPr>
       <w:r>
-        <w:t>Science for Everyone</w:t>
+        <w:t>Physics, Actually</w:t>
       </w:r>
     </w:p>
     <w:p>
@@ -5216,7 +5216,7 @@
         <w:jc w:val="center"/>
       </w:pPr>
       <w:r>
-        <w:t>Science for Everyone</w:t>
+        <w:t>Physics, Actually</w:t>
       </w:r>
     </w:p>
     <w:p>
@@ -5333,7 +5333,7 @@
         <w:jc w:val="center"/>
       </w:pPr>
       <w:r>
-        <w:t>Science for Everyone</w:t>
+        <w:t>Physics, Actually</w:t>
       </w:r>
     </w:p>
     <w:p>
@@ -5464,7 +5464,7 @@
         <w:pStyle w:val="Title"/>
       </w:pPr>
       <w:r>
-        <w:t>Science for Everyone</w:t>
+        <w:t>Physics, Actually</w:t>
       </w:r>
     </w:p>
     <w:p>
@@ -6195,7 +6195,7 @@
         <w:jc w:val="center"/>
       </w:pPr>
       <w:r>
-        <w:t>Science for Everyone</w:t>
+        <w:t>Physics, Actually</w:t>
       </w:r>
     </w:p>
     <w:p>
@@ -6906,7 +6906,7 @@
         <w:jc w:val="center"/>
       </w:pPr>
       <w:r>
-        <w:t>Science for Everyone</w:t>
+        <w:t>Physics, Actually</w:t>
       </w:r>
     </w:p>
     <w:p>
@@ -7679,7 +7679,7 @@
         <w:jc w:val="center"/>
       </w:pPr>
       <w:r>
-        <w:t>Science for Everyone</w:t>
+        <w:t>Physics, Actually</w:t>
       </w:r>
     </w:p>
     <w:p>
@@ -8446,7 +8446,7 @@
         <w:jc w:val="center"/>
       </w:pPr>
       <w:r>
-        <w:t>Science for Everyone</w:t>
+        <w:t>Physics, Actually</w:t>
       </w:r>
     </w:p>
     <w:p>
@@ -8987,7 +8987,7 @@
         <w:pStyle w:val="Heading2"/>
       </w:pPr>
       <w:r>
-        <w:t xml:space="preserve">Why this belongs in science for everyone</w:t>
+        <w:t xml:space="preserve">Why this belongs in Physics, Actually</w:t>
       </w:r>
     </w:p>
     <w:p>
@@ -9116,7 +9116,7 @@
         <w:jc w:val="center"/>
       </w:pPr>
       <w:r>
-        <w:t>Science for Everyone</w:t>
+        <w:t>Physics, Actually</w:t>
       </w:r>
     </w:p>
     <w:p>
@@ -9369,7 +9369,7 @@
         <w:jc w:val="center"/>
       </w:pPr>
       <w:r>
-        <w:t>Science for Everyone</w:t>
+        <w:t>Physics, Actually</w:t>
       </w:r>
     </w:p>
     <w:p>
@@ -10123,7 +10123,7 @@
         <w:pStyle w:val="Title"/>
       </w:pPr>
       <w:r>
-        <w:t>Science for Everyone</w:t>
+        <w:t>Physics, Actually</w:t>
       </w:r>
     </w:p>
     <w:p>

</xml_diff>